<commit_message>
feat: frontend inicio, despensa,recetas, plan
</commit_message>
<xml_diff>
--- a/documentos/HAYMAX - Inventario de pantallas y navegacion.docx
+++ b/documentos/HAYMAX - Inventario de pantallas y navegacion.docx
@@ -6005,7 +6005,7 @@
                 <w:b w:val="0"/>
                 <w:sz w:val="17"/>
               </w:rPr>
-              <w:t>• Tarjeta progreso Lista de compras</w:t>
+              <w:t>• Tarjeta progreso Lista de compras (junto al plato de hoy, acceso rápido)</w:t>
             </w:r>
           </w:p>
           <w:p>
@@ -6727,7 +6727,7 @@
                 <w:b w:val="0"/>
                 <w:sz w:val="17"/>
               </w:rPr>
-              <w:t>→ PLA-01→ PRE-01</w:t>
+              <w:t>→ PLA-01→ PRE-01→ COM-01</w:t>
             </w:r>
           </w:p>
         </w:tc>
@@ -7117,6 +7117,14 @@
                 <w:sz w:val="17"/>
               </w:rPr>
               <w:t>• CTA Planificar / Cocinar ahora</w:t>
+            </w:r>
+          </w:p>
+          <w:p>
+            <w:r>
+              <w:rPr>
+                <w:sz w:val="17"/>
+              </w:rPr>
+              <w:t>• Link Agregar faltantes a mi lista de compras (→ COM-01)</w:t>
             </w:r>
           </w:p>
         </w:tc>
@@ -7387,7 +7395,7 @@
                 <w:b w:val="0"/>
                 <w:sz w:val="17"/>
               </w:rPr>
-              <w:t>→ DES-02→ DES-03→ PRE-03</w:t>
+              <w:t>→ DES-02→ DES-03→ PRE-03→ COM-01</w:t>
             </w:r>
           </w:p>
         </w:tc>
@@ -8384,6 +8392,14 @@
                 <w:sz w:val="17"/>
               </w:rPr>
               <w:t>• Barra inferior</w:t>
+            </w:r>
+          </w:p>
+          <w:p>
+            <w:r>
+              <w:rPr>
+                <w:sz w:val="17"/>
+              </w:rPr>
+              <w:t>• Link Lo que falta está en tu lista de compras (→ COM-01)</w:t>
             </w:r>
           </w:p>
         </w:tc>
@@ -20965,6 +20981,17 @@
           <w:sz w:val="20"/>
         </w:rPr>
         <w:t>INI-01 lista las comidas con los datos principales (porciones, tiempo y precio) y sin imagen: la foto aparece recién al entrar a la receta (REC-02). Asi la pantalla principal queda ligera y no compite con la alerta de vencimientos ni con el plato del dia.</w:t>
+      </w:r>
+    </w:p>
+    <w:p>
+      <w:pPr>
+        <w:pStyle w:val="ListBullet"/>
+      </w:pPr>
+      <w:r>
+        <w:rPr>
+          <w:sz w:val="20"/>
+        </w:rPr>
+        <w:t>La lista de compras (COM-01) queda a dos toques desde cualquier punto del recorrido: tarjeta junto al plato de hoy en INI-01, atajo de faltantes en el detalle de receta (REC-02), atajo desde la despensa (DES-01) y botón de generar/ver lista en PLA-03 y PLA-05.</w:t>
       </w:r>
     </w:p>
     <w:sectPr>

</xml_diff>